<commit_message>
feat(fase3): estrazione biomarcatori citomorfometrici, spaziali e di tessitura
</commit_message>
<xml_diff>
--- a/nuovaproposta_tesi_follicoli_linfatici.docx
+++ b/nuovaproposta_tesi_follicoli_linfatici.docx
@@ -46,27 +46,7 @@
           <w:sz w:val="26"/>
           <w:lang w:val="it-IT"/>
         </w:rPr>
-        <w:t xml:space="preserve">Quantificazione </w:t>
-      </w:r>
-      <w:proofErr w:type="spellStart"/>
-      <w:r>
-        <w:rPr>
-          <w:b/>
-          <w:color w:val="002060"/>
-          <w:sz w:val="26"/>
-          <w:lang w:val="it-IT"/>
-        </w:rPr>
-        <w:t>Citomorfometrica</w:t>
-      </w:r>
-      <w:proofErr w:type="spellEnd"/>
-      <w:r>
-        <w:rPr>
-          <w:b/>
-          <w:color w:val="002060"/>
-          <w:sz w:val="26"/>
-          <w:lang w:val="it-IT"/>
-        </w:rPr>
-        <w:t xml:space="preserve"> e Spaziale della Micro‑Architettura Nucleare per la Classificazione Istopatologica tra Linfoma Follicolare e Tessuto Linfatico Reattivo</w:t>
+        <w:t>Quantificazione Citomorfometrica e Spaziale della MicroArchitettura Nucleare per la Classificazione Istopatologica tra Linfoma Follicolare e Tessuto Linfatico Reattivo</w:t>
       </w:r>
     </w:p>
     <w:p>
@@ -96,21 +76,7 @@
         <w:rPr>
           <w:lang w:val="it-IT"/>
         </w:rPr>
-        <w:t xml:space="preserve">Nel caso dei linfonodi, il linfoma follicolare è caratterizzato da alterazioni della struttura cellulare e nucleare rispetto al tessuto linfatico reattivo. A livello citologico, tali differenze riguardano la forma, la dimensione e l'organizzazione spaziale dei nuclei cellulari. Tuttavia, molte delle differenze morfologiche sono ancora valutate qualitativamente dal patologo. Questa tesi propone lo sviluppo di una pipeline computazionale per segmentare automaticamente i nuclei cellulari mediante tecniche di deep learning e quantificarne la micro‑architettura, generando biomarcatori </w:t>
-      </w:r>
-      <w:proofErr w:type="spellStart"/>
-      <w:r>
-        <w:rPr>
-          <w:lang w:val="it-IT"/>
-        </w:rPr>
-        <w:t>citomorfometrici</w:t>
-      </w:r>
-      <w:proofErr w:type="spellEnd"/>
-      <w:r>
-        <w:rPr>
-          <w:lang w:val="it-IT"/>
-        </w:rPr>
-        <w:t xml:space="preserve"> e spaziali interpretabili.</w:t>
+        <w:t>Nel caso dei linfonodi, il linfoma follicolare è caratterizzato da alterazioni della struttura cellulare e nucleare rispetto al tessuto linfatico reattivo. A livello citologico, tali differenze riguardano la forma, la dimensione e l'organizzazione spaziale dei nuclei cellulari. Tuttavia, molte delle differenze morfologiche sono ancora valutate qualitativamente dal patologo. Questa tesi propone lo sviluppo di una pipeline computazionale per segmentare automaticamente i nuclei cellulari mediante tecniche di deep learning e quantificarne la micro‑architettura, generando biomarcatori citomorfometrici e spaziali interpretabili.</w:t>
       </w:r>
     </w:p>
     <w:p>
@@ -159,76 +125,20 @@
         <w:rPr>
           <w:lang w:val="it-IT"/>
         </w:rPr>
-        <w:t xml:space="preserve">) abbiano dimostrato che modelli </w:t>
+        <w:t xml:space="preserve">) abbiano dimostrato che modelli convoluzionali end-to-end (es. ResNet-18) possono raggiungere un'elevata accuratezza diagnostica nella classificazione tra Linfoma Follicolare e tessuto reattivo, tali approcci operano secondo una logica di "black-box". Le tecniche di spiegabilità post-hoc comunemente impiegate (es. Grad-CAM o LIME) forniscono esclusivamente mappe di calore qualitative a bassa risoluzione spaziale, indicando le regioni salienti senza però quantificare le caratteristiche cellulari determinanti per la decisione clinica. </w:t>
       </w:r>
-      <w:proofErr w:type="spellStart"/>
+    </w:p>
+    <w:p>
+      <w:pPr>
+        <w:rPr>
+          <w:lang w:val="it-IT"/>
+        </w:rPr>
+      </w:pPr>
       <w:r>
         <w:rPr>
           <w:lang w:val="it-IT"/>
         </w:rPr>
-        <w:t>convoluzionali</w:t>
-      </w:r>
-      <w:proofErr w:type="spellEnd"/>
-      <w:r>
-        <w:rPr>
-          <w:lang w:val="it-IT"/>
-        </w:rPr>
-        <w:t xml:space="preserve"> end-to-end (es. ResNet-18) possono raggiungere un'elevata accuratezza diagnostica nella classificazione tra Linfoma Follicolare e tessuto reattivo, tali approcci operano secondo una logica di "black-box". Le tecniche di </w:t>
-      </w:r>
-      <w:proofErr w:type="spellStart"/>
-      <w:r>
-        <w:rPr>
-          <w:lang w:val="it-IT"/>
-        </w:rPr>
-        <w:t>spiegabilità</w:t>
-      </w:r>
-      <w:proofErr w:type="spellEnd"/>
-      <w:r>
-        <w:rPr>
-          <w:lang w:val="it-IT"/>
-        </w:rPr>
-        <w:t xml:space="preserve"> post-hoc comunemente impiegate (es. Grad-CAM o LIME) forniscono esclusivamente mappe di calore qualitative a bassa risoluzione spaziale, indicando le regioni salienti senza però quantificare le caratteristiche cellulari determinanti per la decisione clinica. </w:t>
-      </w:r>
-    </w:p>
-    <w:p>
-      <w:pPr>
-        <w:rPr>
-          <w:lang w:val="it-IT"/>
-        </w:rPr>
-      </w:pPr>
-      <w:r>
-        <w:rPr>
-          <w:lang w:val="it-IT"/>
-        </w:rPr>
-        <w:t xml:space="preserve">La presente proposta di tesi adotta una strategia complementare e intrinsecamente interpretabile ("white-box"): invece di demandare la diagnosi a feature neurali astratte, la pipeline scompone il problema clinico isolando i singoli nuclei tramite modelli di segmentazione (U-Net / </w:t>
-      </w:r>
-      <w:proofErr w:type="spellStart"/>
-      <w:r>
-        <w:rPr>
-          <w:lang w:val="it-IT"/>
-        </w:rPr>
-        <w:t>StarDist</w:t>
-      </w:r>
-      <w:proofErr w:type="spellEnd"/>
-      <w:r>
-        <w:rPr>
-          <w:lang w:val="it-IT"/>
-        </w:rPr>
-        <w:t xml:space="preserve">) ed estraendo biomarcatori fisici rigorosi (metriche </w:t>
-      </w:r>
-      <w:proofErr w:type="spellStart"/>
-      <w:r>
-        <w:rPr>
-          <w:lang w:val="it-IT"/>
-        </w:rPr>
-        <w:t>citomorfometriche</w:t>
-      </w:r>
-      <w:proofErr w:type="spellEnd"/>
-      <w:r>
-        <w:rPr>
-          <w:lang w:val="it-IT"/>
-        </w:rPr>
-        <w:t xml:space="preserve">, densità cellulare e grafi di organizzazione spaziale espressi in </w:t>
+        <w:t xml:space="preserve">La presente proposta di tesi adotta una strategia complementare e intrinsecamente interpretabile ("white-box"): invece di demandare la diagnosi a feature neurali astratte, la pipeline scompone il problema clinico isolando i singoli nuclei tramite modelli di segmentazione (U-Net / StarDist) ed estraendo biomarcatori fisici rigorosi (metriche citomorfometriche, densità cellulare e grafi di organizzazione spaziale espressi in </w:t>
       </w:r>
       <m:oMath>
         <m:r>
@@ -380,21 +290,7 @@
         <w:rPr>
           <w:lang w:val="it-IT"/>
         </w:rPr>
-        <w:t xml:space="preserve">Estrazione di biomarcatori </w:t>
-      </w:r>
-      <w:proofErr w:type="spellStart"/>
-      <w:r>
-        <w:rPr>
-          <w:lang w:val="it-IT"/>
-        </w:rPr>
-        <w:t>citomorfometrici</w:t>
-      </w:r>
-      <w:proofErr w:type="spellEnd"/>
-      <w:r>
-        <w:rPr>
-          <w:lang w:val="it-IT"/>
-        </w:rPr>
-        <w:t xml:space="preserve"> e topologici dei nuclei.</w:t>
+        <w:t>Estrazione di biomarcatori citomorfometrici e topologici dei nuclei.</w:t>
       </w:r>
     </w:p>
     <w:p>
@@ -424,21 +320,7 @@
         <w:rPr>
           <w:lang w:val="it-IT"/>
         </w:rPr>
-        <w:t xml:space="preserve">Interpretazione clinica e </w:t>
-      </w:r>
-      <w:proofErr w:type="spellStart"/>
-      <w:r>
-        <w:rPr>
-          <w:lang w:val="it-IT"/>
-        </w:rPr>
-        <w:t>spiegabilità</w:t>
-      </w:r>
-      <w:proofErr w:type="spellEnd"/>
-      <w:r>
-        <w:rPr>
-          <w:lang w:val="it-IT"/>
-        </w:rPr>
-        <w:t xml:space="preserve"> dei biomarcatori identificati.</w:t>
+        <w:t>Interpretazione clinica e spiegabilità dei biomarcatori identificati.</w:t>
       </w:r>
     </w:p>
     <w:p>
@@ -577,18 +459,8 @@
           <w:color w:val="003366"/>
           <w:sz w:val="28"/>
         </w:rPr>
-        <w:t xml:space="preserve">Workflow </w:t>
+        <w:t>Workflow Metodologico</w:t>
       </w:r>
-      <w:proofErr w:type="spellStart"/>
-      <w:r>
-        <w:rPr>
-          <w:b/>
-          <w:color w:val="003366"/>
-          <w:sz w:val="28"/>
-        </w:rPr>
-        <w:t>Metodologico</w:t>
-      </w:r>
-      <w:proofErr w:type="spellEnd"/>
     </w:p>
     <w:p>
       <w:pPr>
@@ -598,16 +470,8 @@
         <w:rPr>
           <w:b/>
         </w:rPr>
-        <w:t xml:space="preserve">1. Preprocessing delle </w:t>
+        <w:t>1. Preprocessing delle immagini</w:t>
       </w:r>
-      <w:proofErr w:type="spellStart"/>
-      <w:r>
-        <w:rPr>
-          <w:b/>
-        </w:rPr>
-        <w:t>immagini</w:t>
-      </w:r>
-      <w:proofErr w:type="spellEnd"/>
     </w:p>
     <w:p>
       <w:pPr>
@@ -621,35 +485,7 @@
         <w:rPr>
           <w:lang w:val="it-IT"/>
         </w:rPr>
-        <w:t>Normalizzazione del colore (</w:t>
-      </w:r>
-      <w:proofErr w:type="spellStart"/>
-      <w:r>
-        <w:rPr>
-          <w:lang w:val="it-IT"/>
-        </w:rPr>
-        <w:t>stain</w:t>
-      </w:r>
-      <w:proofErr w:type="spellEnd"/>
-      <w:r>
-        <w:rPr>
-          <w:lang w:val="it-IT"/>
-        </w:rPr>
-        <w:t xml:space="preserve"> </w:t>
-      </w:r>
-      <w:proofErr w:type="spellStart"/>
-      <w:r>
-        <w:rPr>
-          <w:lang w:val="it-IT"/>
-        </w:rPr>
-        <w:t>normalization</w:t>
-      </w:r>
-      <w:proofErr w:type="spellEnd"/>
-      <w:r>
-        <w:rPr>
-          <w:lang w:val="it-IT"/>
-        </w:rPr>
-        <w:t>).</w:t>
+        <w:t>Normalizzazione del colore (stain normalization).</w:t>
       </w:r>
     </w:p>
     <w:p>
@@ -693,21 +529,7 @@
         <w:rPr>
           <w:lang w:val="it-IT"/>
         </w:rPr>
-        <w:t xml:space="preserve">Sviluppo di un modello di segmentazione basato su deep learning (U-Net con </w:t>
-      </w:r>
-      <w:proofErr w:type="spellStart"/>
-      <w:r>
-        <w:rPr>
-          <w:lang w:val="it-IT"/>
-        </w:rPr>
-        <w:t>backbone</w:t>
-      </w:r>
-      <w:proofErr w:type="spellEnd"/>
-      <w:r>
-        <w:rPr>
-          <w:lang w:val="it-IT"/>
-        </w:rPr>
-        <w:t xml:space="preserve"> ResNet-34) per individuare ed isolare automaticamente i nuclei cellulari nelle patch.</w:t>
+        <w:t>Sviluppo di un modello di segmentazione basato su deep learning (U-Net con backbone ResNet-34) per individuare ed isolare automaticamente i nuclei cellulari nelle patch.</w:t>
       </w:r>
     </w:p>
     <w:p>
@@ -727,77 +549,7 @@
         <w:rPr>
           <w:lang w:val="it-IT"/>
         </w:rPr>
-        <w:t xml:space="preserve">Creazione delle maschere di segmentazione nucleare di riferimento (Ground Truth) su un sottoinsieme rappresentativo di patch estratte direttamente dal dataset di tesi (es. 20–30 patch) mediante strumenti dedicati (es. </w:t>
-      </w:r>
-      <w:proofErr w:type="spellStart"/>
-      <w:r>
-        <w:rPr>
-          <w:lang w:val="it-IT"/>
-        </w:rPr>
-        <w:t>QuPath</w:t>
-      </w:r>
-      <w:proofErr w:type="spellEnd"/>
-      <w:r>
-        <w:rPr>
-          <w:lang w:val="it-IT"/>
-        </w:rPr>
-        <w:t xml:space="preserve"> / </w:t>
-      </w:r>
-      <w:proofErr w:type="spellStart"/>
-      <w:r>
-        <w:rPr>
-          <w:lang w:val="it-IT"/>
-        </w:rPr>
-        <w:t>ImageJ</w:t>
-      </w:r>
-      <w:proofErr w:type="spellEnd"/>
-      <w:r>
-        <w:rPr>
-          <w:lang w:val="it-IT"/>
-        </w:rPr>
-        <w:t xml:space="preserve">). Il modello U-Net (con </w:t>
-      </w:r>
-      <w:proofErr w:type="spellStart"/>
-      <w:r>
-        <w:rPr>
-          <w:lang w:val="it-IT"/>
-        </w:rPr>
-        <w:t>backbone</w:t>
-      </w:r>
-      <w:proofErr w:type="spellEnd"/>
-      <w:r>
-        <w:rPr>
-          <w:lang w:val="it-IT"/>
-        </w:rPr>
-        <w:t xml:space="preserve"> ResNet-34) viene addestrato e validato direttamente su queste annotazioni di dominio, quantificando le prestazioni tramite Dice </w:t>
-      </w:r>
-      <w:proofErr w:type="spellStart"/>
-      <w:r>
-        <w:rPr>
-          <w:lang w:val="it-IT"/>
-        </w:rPr>
-        <w:t>Coefficient</w:t>
-      </w:r>
-      <w:proofErr w:type="spellEnd"/>
-      <w:r>
-        <w:rPr>
-          <w:lang w:val="it-IT"/>
-        </w:rPr>
-        <w:t xml:space="preserve"> e </w:t>
-      </w:r>
-      <w:proofErr w:type="spellStart"/>
-      <w:r>
-        <w:rPr>
-          <w:lang w:val="it-IT"/>
-        </w:rPr>
-        <w:t>IoU</w:t>
-      </w:r>
-      <w:proofErr w:type="spellEnd"/>
-      <w:r>
-        <w:rPr>
-          <w:lang w:val="it-IT"/>
-        </w:rPr>
-        <w:t>.</w:t>
+        <w:t>Creazione delle maschere di segmentazione nucleare di riferimento (Ground Truth) su un sottoinsieme rappresentativo di patch estratte direttamente dal dataset di tesi (es. 20–30 patch) mediante strumenti dedicati (es. QuPath / ImageJ). Il modello U-Net (con backbone ResNet-34) viene addestrato e validato direttamente su queste annotazioni di dominio, quantificando le prestazioni tramite Dice Coefficient e IoU.</w:t>
       </w:r>
     </w:p>
     <w:p>
@@ -811,57 +563,13 @@
           <w:b/>
           <w:lang w:val="it-IT"/>
         </w:rPr>
-        <w:t xml:space="preserve">Confronto con </w:t>
-      </w:r>
-      <w:proofErr w:type="spellStart"/>
-      <w:r>
-        <w:rPr>
-          <w:b/>
-          <w:lang w:val="it-IT"/>
-        </w:rPr>
-        <w:t>StarDist</w:t>
-      </w:r>
-      <w:proofErr w:type="spellEnd"/>
-      <w:r>
-        <w:rPr>
-          <w:b/>
-          <w:lang w:val="it-IT"/>
-        </w:rPr>
-        <w:t xml:space="preserve"> come benchmark zero-shot: </w:t>
+        <w:t xml:space="preserve">Confronto con StarDist come benchmark zero-shot: </w:t>
       </w:r>
       <w:r>
         <w:rPr>
           <w:lang w:val="it-IT"/>
         </w:rPr>
-        <w:t xml:space="preserve">Le maschere generate dal modello U-Net addestrato sul proprio dataset vengono confrontate sia con la Ground Truth manuale che con quelle ottenute tramite </w:t>
-      </w:r>
-      <w:proofErr w:type="spellStart"/>
-      <w:r>
-        <w:rPr>
-          <w:lang w:val="it-IT"/>
-        </w:rPr>
-        <w:t>StarDist</w:t>
-      </w:r>
-      <w:proofErr w:type="spellEnd"/>
-      <w:r>
-        <w:rPr>
-          <w:lang w:val="it-IT"/>
-        </w:rPr>
-        <w:t xml:space="preserve"> (2D_versatile_he), modello </w:t>
-      </w:r>
-      <w:proofErr w:type="spellStart"/>
-      <w:r>
-        <w:rPr>
-          <w:lang w:val="it-IT"/>
-        </w:rPr>
-        <w:t>pre</w:t>
-      </w:r>
-      <w:proofErr w:type="spellEnd"/>
-      <w:r>
-        <w:rPr>
-          <w:lang w:val="it-IT"/>
-        </w:rPr>
-        <w:t>-addestrato su tessuti H&amp;E, al fine di valutare quantitativamente l'efficacia dell'addestramento specifico sul tessuto linfatico rispetto a modelli generici.</w:t>
+        <w:t>Le maschere generate dal modello U-Net addestrato sul proprio dataset vengono confrontate sia con la Ground Truth manuale che con quelle ottenute tramite StarDist (2D_versatile_he), modello pre-addestrato su tessuti H&amp;E, al fine di valutare quantitativamente l'efficacia dell'addestramento specifico sul tessuto linfatico rispetto a modelli generici.</w:t>
       </w:r>
     </w:p>
     <w:p>
@@ -869,15 +577,7 @@
         <w:spacing w:after="60"/>
       </w:pPr>
       <w:r>
-        <w:t xml:space="preserve">Output </w:t>
-      </w:r>
-      <w:proofErr w:type="spellStart"/>
-      <w:r>
-        <w:t>atteso</w:t>
-      </w:r>
-      <w:proofErr w:type="spellEnd"/>
-      <w:r>
-        <w:t>:</w:t>
+        <w:t>Output atteso:</w:t>
       </w:r>
     </w:p>
     <w:p>
@@ -922,35 +622,7 @@
           <w:lang w:val="it-IT"/>
         </w:rPr>
         <w:lastRenderedPageBreak/>
-        <w:t>Report di validazione quantitativa della segmentazione (Dice/</w:t>
-      </w:r>
-      <w:proofErr w:type="spellStart"/>
-      <w:r>
-        <w:rPr>
-          <w:lang w:val="it-IT"/>
-        </w:rPr>
-        <w:t>IoU</w:t>
-      </w:r>
-      <w:proofErr w:type="spellEnd"/>
-      <w:r>
-        <w:rPr>
-          <w:lang w:val="it-IT"/>
-        </w:rPr>
-        <w:t xml:space="preserve"> su Ground Truth locale e confronto con </w:t>
-      </w:r>
-      <w:proofErr w:type="spellStart"/>
-      <w:r>
-        <w:rPr>
-          <w:lang w:val="it-IT"/>
-        </w:rPr>
-        <w:t>StarDist</w:t>
-      </w:r>
-      <w:proofErr w:type="spellEnd"/>
-      <w:r>
-        <w:rPr>
-          <w:lang w:val="it-IT"/>
-        </w:rPr>
-        <w:t>).</w:t>
+        <w:t>Report di validazione quantitativa della segmentazione (Dice/IoU su Ground Truth locale e confronto con StarDist).</w:t>
       </w:r>
     </w:p>
     <w:p>
@@ -1024,61 +696,19 @@
         </w:rPr>
         <w:t xml:space="preserve">Per garantire la robustezza metodologica della pipeline ed evitare sovrastime di generalizzazione, la validazione dei modelli di machine learning non supervisionato e supervisionato verrà condotta tramite uno schema di </w:t>
       </w:r>
-      <w:proofErr w:type="spellStart"/>
       <w:r>
         <w:rPr>
           <w:b/>
           <w:bCs/>
           <w:lang w:val="it-IT"/>
         </w:rPr>
-        <w:t>Stratified</w:t>
-      </w:r>
-      <w:proofErr w:type="spellEnd"/>
-      <w:r>
-        <w:rPr>
-          <w:b/>
-          <w:bCs/>
-          <w:lang w:val="it-IT"/>
-        </w:rPr>
-        <w:t xml:space="preserve"> K-Fold Cross-</w:t>
-      </w:r>
-      <w:proofErr w:type="spellStart"/>
-      <w:r>
-        <w:rPr>
-          <w:b/>
-          <w:bCs/>
-          <w:lang w:val="it-IT"/>
-        </w:rPr>
-        <w:t>Validation</w:t>
-      </w:r>
-      <w:proofErr w:type="spellEnd"/>
-      <w:r>
-        <w:rPr>
-          <w:b/>
-          <w:bCs/>
-          <w:lang w:val="it-IT"/>
-        </w:rPr>
-        <w:t xml:space="preserve"> a livello di patch</w:t>
+        <w:t>Stratified K-Fold Cross-Validation a livello di patch</w:t>
       </w:r>
       <w:r>
         <w:rPr>
           <w:lang w:val="it-IT"/>
         </w:rPr>
-        <w:t>. Questa procedura consente di quantificare la stabilità statistica delle metriche di performance (</w:t>
-      </w:r>
-      <w:proofErr w:type="spellStart"/>
-      <w:r>
-        <w:rPr>
-          <w:lang w:val="it-IT"/>
-        </w:rPr>
-        <w:t>Accuracy</w:t>
-      </w:r>
-      <w:proofErr w:type="spellEnd"/>
-      <w:r>
-        <w:rPr>
-          <w:lang w:val="it-IT"/>
-        </w:rPr>
-        <w:t>, Precision, Recall, AUC-ROC). Nella discussione dei risultati si terrà conto della granularità a livello di patch come caratteristica intrinseca del dataset aperto utilizzato.</w:t>
+        <w:t>. Questa procedura consente di quantificare la stabilità statistica delle metriche di performance (Accuracy, Precision, Recall, AUC-ROC). Nella discussione dei risultati si terrà conto della granularità a livello di patch come caratteristica intrinseca del dataset aperto utilizzato.</w:t>
       </w:r>
     </w:p>
     <w:p>
@@ -1135,23 +765,7 @@
           <w:b/>
           <w:lang w:val="it-IT"/>
         </w:rPr>
-        <w:t xml:space="preserve">4. Estrazione dei biomarcatori </w:t>
-      </w:r>
-      <w:proofErr w:type="spellStart"/>
-      <w:r>
-        <w:rPr>
-          <w:b/>
-          <w:lang w:val="it-IT"/>
-        </w:rPr>
-        <w:t>citomorfometrici</w:t>
-      </w:r>
-      <w:proofErr w:type="spellEnd"/>
-      <w:r>
-        <w:rPr>
-          <w:b/>
-          <w:lang w:val="it-IT"/>
-        </w:rPr>
-        <w:t xml:space="preserve"> e spaziali</w:t>
+        <w:t>4. Estrazione dei biomarcatori citomorfometrici e spaziali</w:t>
       </w:r>
     </w:p>
     <w:p>
@@ -1195,21 +809,7 @@
         <w:rPr>
           <w:lang w:val="it-IT"/>
         </w:rPr>
-        <w:t xml:space="preserve">Pleomorfismo e variabilità della geometria nucleare (deviazione standard e </w:t>
-      </w:r>
-      <w:proofErr w:type="spellStart"/>
-      <w:r>
-        <w:rPr>
-          <w:lang w:val="it-IT"/>
-        </w:rPr>
-        <w:t>skewness</w:t>
-      </w:r>
-      <w:proofErr w:type="spellEnd"/>
-      <w:r>
-        <w:rPr>
-          <w:lang w:val="it-IT"/>
-        </w:rPr>
-        <w:t xml:space="preserve"> dell'area in µm² e della circolarità intra-patch)</w:t>
+        <w:t>Pleomorfismo e variabilità della geometria nucleare (deviazione standard e skewness dell'area in µm² e della circolarità intra-patch)</w:t>
       </w:r>
     </w:p>
     <w:p>
@@ -1269,21 +869,7 @@
         <w:rPr>
           <w:lang w:val="it-IT"/>
         </w:rPr>
-        <w:t xml:space="preserve">Proprietà di tessitura e colore del tessuto (GLCM </w:t>
-      </w:r>
-      <w:proofErr w:type="spellStart"/>
-      <w:r>
-        <w:rPr>
-          <w:lang w:val="it-IT"/>
-        </w:rPr>
-        <w:t>Haralick</w:t>
-      </w:r>
-      <w:proofErr w:type="spellEnd"/>
-      <w:r>
-        <w:rPr>
-          <w:lang w:val="it-IT"/>
-        </w:rPr>
-        <w:t>, LBP, momenti cromatici CIE-LAB)</w:t>
+        <w:t>Proprietà di tessitura e colore del tessuto (GLCM Haralick, LBP, momenti cromatici CIE-LAB)</w:t>
       </w:r>
     </w:p>
     <w:p>
@@ -1312,50 +898,15 @@
         <w:rPr>
           <w:lang w:val="it-IT"/>
         </w:rPr>
-        <w:t xml:space="preserve">I biomarcatori </w:t>
-      </w:r>
-      <w:proofErr w:type="spellStart"/>
-      <w:r>
-        <w:rPr>
-          <w:lang w:val="it-IT"/>
-        </w:rPr>
-        <w:t>citomorfometrici</w:t>
-      </w:r>
-      <w:proofErr w:type="spellEnd"/>
-      <w:r>
-        <w:rPr>
-          <w:lang w:val="it-IT"/>
-        </w:rPr>
-        <w:t xml:space="preserve"> estratti verranno utilizzati per addestrare modelli di classificazione (Random Forest, SVM o modelli neurali) con l’obiettivo di distinguere tra linfoma follicolare e tessuto reattivo.</w:t>
+        <w:t>I biomarcatori citomorfometrici estratti verranno utilizzati per addestrare modelli di classificazione (Random Forest, SVM o modelli neurali) con l’obiettivo di distinguere tra linfoma follicolare e tessuto reattivo.</w:t>
       </w:r>
     </w:p>
     <w:p>
       <w:pPr>
         <w:spacing w:after="60"/>
       </w:pPr>
-      <w:proofErr w:type="spellStart"/>
       <w:r>
-        <w:t>Saranno</w:t>
-      </w:r>
-      <w:proofErr w:type="spellEnd"/>
-      <w:r>
-        <w:t xml:space="preserve"> </w:t>
-      </w:r>
-      <w:proofErr w:type="spellStart"/>
-      <w:r>
-        <w:t>valutate</w:t>
-      </w:r>
-      <w:proofErr w:type="spellEnd"/>
-      <w:r>
-        <w:t xml:space="preserve"> </w:t>
-      </w:r>
-      <w:proofErr w:type="spellStart"/>
-      <w:r>
-        <w:t>metriche</w:t>
-      </w:r>
-      <w:proofErr w:type="spellEnd"/>
-      <w:r>
-        <w:t xml:space="preserve"> come:</w:t>
+        <w:t>Saranno valutate metriche come:</w:t>
       </w:r>
     </w:p>
     <w:p>
@@ -1414,30 +965,8 @@
           <w:b/>
         </w:rPr>
         <w:lastRenderedPageBreak/>
-        <w:t xml:space="preserve">6. </w:t>
+        <w:t>6. Interpretazione clinica</w:t>
       </w:r>
-      <w:proofErr w:type="spellStart"/>
-      <w:r>
-        <w:rPr>
-          <w:b/>
-        </w:rPr>
-        <w:t>Interpretazione</w:t>
-      </w:r>
-      <w:proofErr w:type="spellEnd"/>
-      <w:r>
-        <w:rPr>
-          <w:b/>
-        </w:rPr>
-        <w:t xml:space="preserve"> </w:t>
-      </w:r>
-      <w:proofErr w:type="spellStart"/>
-      <w:r>
-        <w:rPr>
-          <w:b/>
-        </w:rPr>
-        <w:t>clinica</w:t>
-      </w:r>
-      <w:proofErr w:type="spellEnd"/>
     </w:p>
     <w:p>
       <w:pPr>
@@ -1463,77 +992,7 @@
         <w:rPr>
           <w:lang w:val="it-IT"/>
         </w:rPr>
-        <w:t xml:space="preserve">Analisi di </w:t>
-      </w:r>
-      <w:proofErr w:type="spellStart"/>
-      <w:r>
-        <w:rPr>
-          <w:lang w:val="it-IT"/>
-        </w:rPr>
-        <w:t>Spiegabilità</w:t>
-      </w:r>
-      <w:proofErr w:type="spellEnd"/>
-      <w:r>
-        <w:rPr>
-          <w:lang w:val="it-IT"/>
-        </w:rPr>
-        <w:t xml:space="preserve"> (XAI) mediante SHAP (</w:t>
-      </w:r>
-      <w:proofErr w:type="spellStart"/>
-      <w:r>
-        <w:rPr>
-          <w:lang w:val="it-IT"/>
-        </w:rPr>
-        <w:t>SHapley</w:t>
-      </w:r>
-      <w:proofErr w:type="spellEnd"/>
-      <w:r>
-        <w:rPr>
-          <w:lang w:val="it-IT"/>
-        </w:rPr>
-        <w:t xml:space="preserve"> Additive </w:t>
-      </w:r>
-      <w:proofErr w:type="spellStart"/>
-      <w:r>
-        <w:rPr>
-          <w:lang w:val="it-IT"/>
-        </w:rPr>
-        <w:t>exPlanations</w:t>
-      </w:r>
-      <w:proofErr w:type="spellEnd"/>
-      <w:r>
-        <w:rPr>
-          <w:lang w:val="it-IT"/>
-        </w:rPr>
-        <w:t xml:space="preserve">) e </w:t>
-      </w:r>
-      <w:proofErr w:type="spellStart"/>
-      <w:r>
-        <w:rPr>
-          <w:lang w:val="it-IT"/>
-        </w:rPr>
-        <w:t>Permutation</w:t>
-      </w:r>
-      <w:proofErr w:type="spellEnd"/>
-      <w:r>
-        <w:rPr>
-          <w:lang w:val="it-IT"/>
-        </w:rPr>
-        <w:t xml:space="preserve"> Feature </w:t>
-      </w:r>
-      <w:proofErr w:type="spellStart"/>
-      <w:r>
-        <w:rPr>
-          <w:lang w:val="it-IT"/>
-        </w:rPr>
-        <w:t>Importance</w:t>
-      </w:r>
-      <w:proofErr w:type="spellEnd"/>
-      <w:r>
-        <w:rPr>
-          <w:lang w:val="it-IT"/>
-        </w:rPr>
-        <w:t xml:space="preserve"> per quantificare l'impatto clinico-diagnostico dei singoli biomarcatori.</w:t>
+        <w:t>Analisi di Spiegabilità (XAI) mediante SHAP (SHapley Additive exPlanations) e Permutation Feature Importance per quantificare l'impatto clinico-diagnostico dei singoli biomarcatori.</w:t>
       </w:r>
     </w:p>
     <w:p>
@@ -1570,21 +1029,7 @@
         <w:rPr>
           <w:lang w:val="it-IT"/>
         </w:rPr>
-        <w:t xml:space="preserve">La tesi porterà allo sviluppo di un sistema computazionale capace di estrarre biomarcatori </w:t>
-      </w:r>
-      <w:proofErr w:type="spellStart"/>
-      <w:r>
-        <w:rPr>
-          <w:lang w:val="it-IT"/>
-        </w:rPr>
-        <w:t>citomorfometrici</w:t>
-      </w:r>
-      <w:proofErr w:type="spellEnd"/>
-      <w:r>
-        <w:rPr>
-          <w:lang w:val="it-IT"/>
-        </w:rPr>
-        <w:t xml:space="preserve"> ed interpretabili dalla micro‑architettura nucleare. Questi biomarcatori potranno contribuire alla diagnosi assistita da AI e all’identificazione di pattern morfologici e spaziali associati al linfoma follicolare.</w:t>
+        <w:t>La tesi porterà allo sviluppo di un sistema computazionale capace di estrarre biomarcatori citomorfometrici ed interpretabili dalla micro‑architettura nucleare. Questi biomarcatori potranno contribuire alla diagnosi assistita da AI e all’identificazione di pattern morfologici e spaziali associati al linfoma follicolare.</w:t>
       </w:r>
     </w:p>
     <w:sectPr>
@@ -2410,6 +1855,7 @@
   <w:style w:type="character" w:default="1" w:styleId="Carpredefinitoparagrafo">
     <w:name w:val="Default Paragraph Font"/>
     <w:uiPriority w:val="1"/>
+    <w:semiHidden/>
     <w:unhideWhenUsed/>
   </w:style>
   <w:style w:type="table" w:default="1" w:styleId="Tabellanormale">

</xml_diff>